<commit_message>
Align Section 10 research design and run Word export with traceable route figures
</commit_message>
<xml_diff>
--- a/training/section-10/grant-packet/output/grant-draft.docx
+++ b/training/section-10/grant-packet/output/grant-draft.docx
@@ -20,7 +20,7 @@
     </w:p>
     <w:p>
       <w:r>
-        <w:t>大学课程中的AI辅导需要区分当时做对题和离开工具后独立解题。Bastani等的高中数学研究采用不同AI辅导条件与无辅助测验，说明研究设计可以分别观察工具使用阶段和独立作答阶段。本例拟在大学入门统计课程中比较分步提示与常规问答，观察提示方式与独立解题表现的关系。需要先完成相关文献检索，确认大学情境下已有研究及本方案的具体差异；当前不主张首次发现或已证明创新性。</w:t>
+        <w:t>大学课程中的AI辅导需要区分当时做对题和离开工具后独立解题。Bastani等的高中数学研究采用不同AI辅导条件与无辅助测验，说明研究设计可以分别观察工具使用阶段和独立作答阶段。本例拟在大学入门统计课程中比较分步提示与完整解答，观察提示方式与独立解题表现的关系。需要先完成相关文献检索，确认大学情境下已有研究及本方案的具体差异；当前不主张首次发现或已证明创新性。</w:t>
         <w:br/>
         <w:t>依据：BASTANI, DESIGN</w:t>
       </w:r>
@@ -35,11 +35,11 @@
     </w:p>
     <w:p>
       <w:r>
-        <w:t>研究问题是：在模型、练习题目与时间相同的条件下，要求学习者先写出思路再获得提示，是否改变其后续独立解题表现？拟比较两种辅导条件：常规问答允许直接获得解答；分步提示先要求展示已有步骤，再提供下一步线索。正式研究前需取得伦理审查意见与材料使用授权，并根据主要结局、预期效应、分配单位及失访情况确定样本量。</w:t>
+        <w:t>研究问题是：在模型、练习题目与时间相同的条件下，要求学习者先写出思路再获得提示，是否改变其后续独立解题表现？拟比较两种辅导条件：完整解答允许直接获得解答；分步提示先要求展示已有步骤，再提供下一步线索。正式研究前需取得伦理审查意见与材料使用授权，并根据主要结局、预期效应、分配单位及失访情况确定样本量。</w:t>
         <w:br/>
-        <w:t>研究内容包括题目与评分规则的预试核对、两种条件下的作答过程记录、无AI新题测验以及过程和测验结果的联合解释。主要结局拟为无AI新题测验成绩，过程指标包括独立尝试、求助和修正记录。分配方式及其可行性需先核定；若按班级分配，应在设计和分析中处理班级相关性。过程记录不能单独证明学习机制。</w:t>
+        <w:t>研究内容包括题目与评分规则的预试核对、两种条件下的作答过程记录、一周后无AI新题测验以及过程和测验结果的联合解释。主要结局拟为一周后无AI新题测验成绩，过程指标包括独立尝试、求助和修正记录。分配方式及其可行性需先核定；若按班级分配，应在设计和分析中处理班级相关性。过程记录不能单独证明学习机制。</w:t>
         <w:br/>
-        <w:t>课程示例暂按12个月安排材料准备、预试、实施、分析与归档，此期限仅用于演示。若提示规则执行不稳定，应先修订并重新预试；若无法开展分组比较，应调整研究目标，并明确证据强度变化，不能沿用原因果表述。具体测量时间、样本量、阈值与成本尚未确定。</w:t>
+        <w:t>课程示例暂按12个月安排材料准备、预试、实施、分析与归档，此期限仅用于演示。若提示规则执行不稳定，应先修订并重新预试；若无法开展分组比较，应调整研究目标，并明确证据强度变化，不能沿用原因果表述。主要测量拟在练习后一周进行，使用5道新题、每题0至20分、总分0至100分；测验效度和评分规则仍待核。Section 6所列每组50人的容量仅来自教学假设，不是本项目已确定样本量。分配单位及独立性、缺失处理、阈值与成本仍待核定。</w:t>
         <w:br/>
         <w:t>依据：DESIGN, TEACH-GUIDE</w:t>
       </w:r>
@@ -53,6 +53,9 @@
       </w:r>
     </w:p>
     <w:p>
+      <w:pPr>
+        <w:keepLines/>
+      </w:pPr>
       <w:r>
         <w:t>当前没有申请人的真实前期数据、代表作贡献说明、课程准入证明或设备与合作承诺。本节仅提供公开研究来源和自编研究设想，二者均不能充当申请人研究基础。上述材料仍需申请人提供并核实；本教学稿未开展采样或获得伦理批准。</w:t>
         <w:br/>
@@ -110,6 +113,106 @@
     <w:p>
       <w:r>
         <w:t>HUMAN-SIGNOFF  需要研究者对输入和模板的当前版本签核</w:t>
+      </w:r>
+    </w:p>
+    <w:p>
+      <w:r>
+        <w:br w:type="page"/>
+      </w:r>
+    </w:p>
+    <w:p>
+      <w:pPr>
+        <w:pStyle w:val="Heading1"/>
+      </w:pPr>
+      <w:r>
+        <w:t>研究技术路线与材料核对</w:t>
+      </w:r>
+    </w:p>
+    <w:p>
+      <w:r>
+        <w:t>以下为拟议研究的教学示意。研究尚未实施，图中的启动条件也尚未核定。图示编辑源随包保留，箭头表示工作次序，不表示因果效应。</w:t>
+      </w:r>
+    </w:p>
+    <w:p>
+      <w:r>
+        <w:t>图1 分步提示与完整解答的比较及一周后测量 教学拟议</w:t>
+      </w:r>
+    </w:p>
+    <w:p>
+      <w:r>
+        <w:drawing>
+          <wp:inline xmlns:a="http://schemas.openxmlformats.org/drawingml/2006/main" xmlns:pic="http://schemas.openxmlformats.org/drawingml/2006/picture">
+            <wp:extent cx="5760000" cy="2522024"/>
+            <wp:docPr id="1" name="Picture 1"/>
+            <wp:cNvGraphicFramePr>
+              <a:graphicFrameLocks noChangeAspect="1"/>
+            </wp:cNvGraphicFramePr>
+            <a:graphic>
+              <a:graphicData uri="http://schemas.openxmlformats.org/drawingml/2006/picture">
+                <pic:pic>
+                  <pic:nvPicPr>
+                    <pic:cNvPr id="0" name="研究技术路线.png"/>
+                    <pic:cNvPicPr/>
+                  </pic:nvPicPr>
+                  <pic:blipFill>
+                    <a:blip r:embed="rId9"/>
+                    <a:stretch>
+                      <a:fillRect/>
+                    </a:stretch>
+                  </pic:blipFill>
+                  <pic:spPr>
+                    <a:xfrm>
+                      <a:off x="0" y="0"/>
+                      <a:ext cx="5760000" cy="2522024"/>
+                    </a:xfrm>
+                    <a:prstGeom prst="rect"/>
+                  </pic:spPr>
+                </pic:pic>
+              </a:graphicData>
+            </a:graphic>
+          </wp:inline>
+        </w:drawing>
+      </w:r>
+    </w:p>
+    <w:p>
+      <w:r>
+        <w:t>图2 材料核对不齐时的修订与复查 教学拟议</w:t>
+      </w:r>
+    </w:p>
+    <w:p>
+      <w:r>
+        <w:drawing>
+          <wp:inline xmlns:a="http://schemas.openxmlformats.org/drawingml/2006/main" xmlns:pic="http://schemas.openxmlformats.org/drawingml/2006/picture">
+            <wp:extent cx="5760000" cy="2522024"/>
+            <wp:docPr id="2" name="Picture 2"/>
+            <wp:cNvGraphicFramePr>
+              <a:graphicFrameLocks noChangeAspect="1"/>
+            </wp:cNvGraphicFramePr>
+            <a:graphic>
+              <a:graphicData uri="http://schemas.openxmlformats.org/drawingml/2006/picture">
+                <pic:pic>
+                  <pic:nvPicPr>
+                    <pic:cNvPr id="0" name="材料核对与返工.png"/>
+                    <pic:cNvPicPr/>
+                  </pic:nvPicPr>
+                  <pic:blipFill>
+                    <a:blip r:embed="rId10"/>
+                    <a:stretch>
+                      <a:fillRect/>
+                    </a:stretch>
+                  </pic:blipFill>
+                  <pic:spPr>
+                    <a:xfrm>
+                      <a:off x="0" y="0"/>
+                      <a:ext cx="5760000" cy="2522024"/>
+                    </a:xfrm>
+                    <a:prstGeom prst="rect"/>
+                  </pic:spPr>
+                </pic:pic>
+              </a:graphicData>
+            </a:graphic>
+          </wp:inline>
+        </w:drawing>
       </w:r>
     </w:p>
     <w:sectPr>
@@ -842,7 +945,7 @@
       <w:color w:val="000000"/>
       <w:spacing w:val="5"/>
       <w:kern w:val="28"/>
-      <w:sz w:val="52"/>
+      <w:sz w:val="36"/>
       <w:szCs w:val="52"/>
     </w:rPr>
   </w:style>

</xml_diff>